<commit_message>
Design doc v0.3: multi-planet hard sci-fi tone, early-2000s military feel, rain limited to FO7
</commit_message>
<xml_diff>
--- a/Design_Document_v0.1.docx
+++ b/Design_Document_v0.1.docx
@@ -47,7 +47,7 @@
           <w:sz w:val="18"/>
           <w:szCs w:val="18"/>
         </w:rPr>
-        <w:t xml:space="preserve">August 2026  ·  Solo Developer  ·  Godot  ·  v0.2</w:t>
+        <w:t>October 2026  ·  Solo Developer  ·  Godot  ·  v0.3</w:t>
       </w:r>
     </w:p>
     <w:p>
@@ -63,7 +63,7 @@
         <w:spacing w:after="120"/>
       </w:pPr>
       <w:r>
-        <w:t xml:space="preserve">A grounded military science-fiction FPS that captures the movement and weapon-sandbox soul of Bungie-era Halo (Halo 2, Reach, ODST) while absorbing the tactical professionalism, grit, and industrial darkness of Star Wars: Republic Commando. The player is an elite operator, not a mythic hero. The fantasy is competent special forces doing an ugly job under rain and radio static. Readable sandbox combat, superhuman-but-weighty movement, and a tone that could double as modern Marine Corps / special-operations propaganda.</w:t>
+        <w:t>A grounded military science-fiction FPS that captures the movement and weapon-sandbox soul of Bungie-era Halo (Halo 2, Reach, ODST) while absorbing the tactical professionalism, grit, and industrial darkness of Star Wars: Republic Commando. The player is an elite operator, not a mythic hero. The fantasy is competent special forces doing an ugly job across a multi-planet war, under radio static. Readable sandbox combat, superhuman-but-weighty movement, and a tone that could double as modern Marine Corps / special-operations propaganda.</w:t>
       </w:r>
     </w:p>
     <w:p>
@@ -111,7 +111,7 @@
         <w:t xml:space="preserve">Campaign = Heart. </w:t>
       </w:r>
       <w:r>
-        <w:t xml:space="preserve">Short, atmospheric, melancholy storytelling with a doomed military tone. Lonely outposts, rain-slicked colonies, quiet competence under impossible odds. Not spectacle-driven.</w:t>
+        <w:t>Short, atmospheric, melancholy storytelling with a doomed military tone. Lonely outposts on distant worlds, quiet competence under impossible odds. Not spectacle-driven.</w:t>
       </w:r>
     </w:p>
     <w:p>
@@ -151,7 +151,7 @@
         <w:t xml:space="preserve">Tone &amp; Aesthetic. </w:t>
       </w:r>
       <w:r>
-        <w:t xml:space="preserve">Modern take on Halo 2 visual language filtered through Republic Commando’s industrial darkness and special-forces professionalism. Original IP. Practical armor, brutalist colonial architecture, rain, harsh practical lighting, clipped radio chatter. Feels like recruitment material for elite operators who expect to get dirty.</w:t>
+        <w:t>A multi-planet hard science-fiction war in the tradition of Eric Nylund's Halo novels, Larry Niven's Ringworld, and Orson Scott Card: grounded military culture, megastructure-scale engineering, and the strategic and moral weight of interstellar war. Original IP. The feel is early-2000s military the way Halo 2 has it. The technology is fully science fiction, but the culture, tone, and presentation come from that era: Marines who are professional and dry-humored under pressure, clipped radio chatter and squad banter, pride in the uniform alongside the grim weight of a long war. Hardware is chunky, practical, and field-maintained, never sleek or ornamental. Visually: high-fidelity rendering with late-90s / early-2000s design sensibilities, bold readable silhouettes, utilitarian industrial architecture, practical in-world lighting, and environments that read clearly in combat. Each planet has its own climate, palette, and atmosphere; the military design language stays consistent across the setting.</w:t>
       </w:r>
     </w:p>
     <w:p>
@@ -380,7 +380,7 @@
         <w:spacing w:after="80"/>
       </w:pPr>
       <w:r>
-        <w:t xml:space="preserve">Compact colonial military outpost under constant rain. Central courtyard with partial cover and raised command platform. Two multi-level structures linked by catwalks and ramps. Tight industrial interiors. Elevated overwatch perch. Strong verticality and readable sightlines. Wet reflective surfaces, harsh practical lighting, distant radio traffic and rain as the primary atmosphere. Size: learnable in under 90 seconds of free roam.</w:t>
+        <w:t>Compact colonial military outpost under heavy rain (rain is specific to this level, not the whole game). Central courtyard with partial cover and raised command platform. Two multi-level structures linked by catwalks and ramps. Tight industrial interiors. Elevated overwatch perch. Strong verticality and readable sightlines. Wet reflective surfaces, harsh practical lighting, distant radio traffic and rain as the primary atmosphere. Size: learnable in under 90 seconds of free roam.</w:t>
       </w:r>
     </w:p>
     <w:p>
@@ -630,7 +630,7 @@
         <w:spacing w:after="80"/>
       </w:pPr>
       <w:r>
-        <w:t xml:space="preserve">v0.2 locks the Republic Commando layer (professionalism, secondary fire modes, industrial grit, brutal melee) into the pillars and the Forward Outpost 7 vertical slice. This document remains the north star. Any feature that does not serve the pillars or the vertical-slice goals is deferred or cut.</w:t>
+        <w:t>v0.2 locks the Republic Commando layer (professionalism, secondary fire modes, industrial grit, brutal melee) into the pillars and the Forward Outpost 7 vertical slice. v0.3 reframes tone and aesthetic as a multi-planet hard sci-fi war with an early-2000s, Halo 2-era military feel, and makes rain specific to Forward Outpost 7. This document remains the north star. Any feature that does not serve the pillars or the vertical-slice goals is deferred or cut.</w:t>
       </w:r>
     </w:p>
     <w:p>

</xml_diff>